<commit_message>
Poprawiono bledy w instrukcji do CMAKE
</commit_message>
<xml_diff>
--- a/Instrukcja instalacji biblioteki do grafiki w C++ CMAKE.docx
+++ b/Instrukcja instalacji biblioteki do grafiki w C++ CMAKE.docx
@@ -627,7 +627,7 @@
           <w:rFonts w:ascii="Courier New" w:eastAsia="Times New Roman" w:hAnsi="Courier New" w:cs="Courier New"/>
           <w:sz w:val="20"/>
           <w:szCs w:val="20"/>
-          <w:lang w:val="en-GB" w:eastAsia="pl-PL"/>
+          <w:lang w:eastAsia="pl-PL"/>
         </w:rPr>
         <w:t>D:\PB\2026\CPP2026</w:t>
       </w:r>
@@ -821,7 +821,7 @@
           <w:szCs w:val="20"/>
           <w:lang w:val="en-GB" w:eastAsia="pl-PL"/>
         </w:rPr>
-        <w:t>cmake -B build -A x64 -DCMAKE_INSTALL_PREFIX="../install" -DFLTK_BUILD_TEST=OFF -DFLTK_BUILD_EXAMPLES=OFF</w:t>
+        <w:t>cmake -B build -A x64 -DCMAKE_INSTALL_PREFIX="install" -DFLTK_BUILD_TEST=OFF -DFLTK_BUILD_EXAMPLES=OFF</w:t>
       </w:r>
     </w:p>
     <w:p>
@@ -1333,7 +1333,7 @@
           <w:rFonts w:ascii="Courier New" w:eastAsia="Times New Roman" w:hAnsi="Courier New" w:cs="Courier New"/>
           <w:sz w:val="20"/>
           <w:szCs w:val="20"/>
-          <w:lang w:eastAsia="pl-PL"/>
+          <w:lang w:val="en-GB" w:eastAsia="pl-PL"/>
         </w:rPr>
       </w:pPr>
     </w:p>
@@ -1375,15 +1375,15 @@
           <w:rFonts w:ascii="Courier New" w:eastAsia="Times New Roman" w:hAnsi="Courier New" w:cs="Courier New"/>
           <w:sz w:val="20"/>
           <w:szCs w:val="20"/>
-          <w:lang w:val="en-GB" w:eastAsia="pl-PL"/>
-        </w:rPr>
-      </w:pPr>
-      <w:r>
-        <w:rPr>
-          <w:rFonts w:ascii="Courier New" w:eastAsia="Times New Roman" w:hAnsi="Courier New" w:cs="Courier New"/>
-          <w:sz w:val="20"/>
-          <w:szCs w:val="20"/>
-          <w:lang w:val="en-GB" w:eastAsia="pl-PL"/>
+          <w:lang w:eastAsia="pl-PL"/>
+        </w:rPr>
+      </w:pPr>
+      <w:r>
+        <w:rPr>
+          <w:rFonts w:ascii="Courier New" w:eastAsia="Times New Roman" w:hAnsi="Courier New" w:cs="Courier New"/>
+          <w:sz w:val="20"/>
+          <w:szCs w:val="20"/>
+          <w:lang w:eastAsia="pl-PL"/>
         </w:rPr>
         <w:t>D:\PB\2026\CPP2026\dev\GUI-PPP2-main</w:t>
       </w:r>
@@ -1414,15 +1414,15 @@
           <w:rFonts w:ascii="Courier New" w:eastAsia="Times New Roman" w:hAnsi="Courier New" w:cs="Courier New"/>
           <w:sz w:val="20"/>
           <w:szCs w:val="20"/>
-          <w:lang w:val="en-GB" w:eastAsia="pl-PL"/>
-        </w:rPr>
-      </w:pPr>
-      <w:r>
-        <w:rPr>
-          <w:rFonts w:ascii="Courier New" w:eastAsia="Times New Roman" w:hAnsi="Courier New" w:cs="Courier New"/>
-          <w:sz w:val="20"/>
-          <w:szCs w:val="20"/>
-          <w:lang w:val="en-GB" w:eastAsia="pl-PL"/>
+          <w:lang w:eastAsia="pl-PL"/>
+        </w:rPr>
+      </w:pPr>
+      <w:r>
+        <w:rPr>
+          <w:rFonts w:ascii="Courier New" w:eastAsia="Times New Roman" w:hAnsi="Courier New" w:cs="Courier New"/>
+          <w:sz w:val="20"/>
+          <w:szCs w:val="20"/>
+          <w:lang w:eastAsia="pl-PL"/>
         </w:rPr>
         <w:t>├── CMakeLists.txt</w:t>
       </w:r>
@@ -1453,15 +1453,15 @@
           <w:rFonts w:ascii="Courier New" w:eastAsia="Times New Roman" w:hAnsi="Courier New" w:cs="Courier New"/>
           <w:sz w:val="20"/>
           <w:szCs w:val="20"/>
-          <w:lang w:val="en-GB" w:eastAsia="pl-PL"/>
-        </w:rPr>
-      </w:pPr>
-      <w:r>
-        <w:rPr>
-          <w:rFonts w:ascii="Courier New" w:eastAsia="Times New Roman" w:hAnsi="Courier New" w:cs="Courier New"/>
-          <w:sz w:val="20"/>
-          <w:szCs w:val="20"/>
-          <w:lang w:val="en-GB" w:eastAsia="pl-PL"/>
+          <w:lang w:eastAsia="pl-PL"/>
+        </w:rPr>
+      </w:pPr>
+      <w:r>
+        <w:rPr>
+          <w:rFonts w:ascii="Courier New" w:eastAsia="Times New Roman" w:hAnsi="Courier New" w:cs="Courier New"/>
+          <w:sz w:val="20"/>
+          <w:szCs w:val="20"/>
+          <w:lang w:eastAsia="pl-PL"/>
         </w:rPr>
         <w:t>├── main.cpp</w:t>
       </w:r>
@@ -1492,15 +1492,15 @@
           <w:rFonts w:ascii="Courier New" w:eastAsia="Times New Roman" w:hAnsi="Courier New" w:cs="Courier New"/>
           <w:sz w:val="20"/>
           <w:szCs w:val="20"/>
-          <w:lang w:val="en-GB" w:eastAsia="pl-PL"/>
-        </w:rPr>
-      </w:pPr>
-      <w:r>
-        <w:rPr>
-          <w:rFonts w:ascii="Courier New" w:eastAsia="Times New Roman" w:hAnsi="Courier New" w:cs="Courier New"/>
-          <w:sz w:val="20"/>
-          <w:szCs w:val="20"/>
-          <w:lang w:val="en-GB" w:eastAsia="pl-PL"/>
+          <w:lang w:eastAsia="pl-PL"/>
+        </w:rPr>
+      </w:pPr>
+      <w:r>
+        <w:rPr>
+          <w:rFonts w:ascii="Courier New" w:eastAsia="Times New Roman" w:hAnsi="Courier New" w:cs="Courier New"/>
+          <w:sz w:val="20"/>
+          <w:szCs w:val="20"/>
+          <w:lang w:eastAsia="pl-PL"/>
         </w:rPr>
         <w:t>└── GUI-PPP2   (</w:t>
       </w:r>
@@ -1509,7 +1509,7 @@
           <w:rFonts w:ascii="Courier New" w:eastAsia="Times New Roman" w:hAnsi="Courier New" w:cs="Courier New"/>
           <w:sz w:val="20"/>
           <w:szCs w:val="20"/>
-          <w:lang w:val="en-GB" w:eastAsia="pl-PL"/>
+          <w:lang w:eastAsia="pl-PL"/>
         </w:rPr>
         <w:t>pliki biblioteki GUI</w:t>
       </w:r>
@@ -1518,7 +1518,7 @@
           <w:rFonts w:ascii="Courier New" w:eastAsia="Times New Roman" w:hAnsi="Courier New" w:cs="Courier New"/>
           <w:sz w:val="20"/>
           <w:szCs w:val="20"/>
-          <w:lang w:val="en-GB" w:eastAsia="pl-PL"/>
+          <w:lang w:eastAsia="pl-PL"/>
         </w:rPr>
         <w:t>)</w:t>
       </w:r>
@@ -1562,12 +1562,39 @@
         </w:numPr>
         <w:spacing w:before="100" w:beforeAutospacing="1" w:after="100" w:afterAutospacing="1" w:line="240" w:lineRule="auto"/>
         <w:rPr>
+          <w:rFonts w:ascii="Courier New" w:eastAsia="Times New Roman" w:hAnsi="Courier New" w:cs="Courier New"/>
+          <w:sz w:val="20"/>
+          <w:szCs w:val="20"/>
+          <w:lang w:eastAsia="pl-PL"/>
+        </w:rPr>
+      </w:pPr>
+      <w:r>
+        <w:rPr>
           <w:rFonts w:ascii="Times New Roman" w:eastAsia="Times New Roman" w:hAnsi="Times New Roman" w:cs="Times New Roman"/>
           <w:sz w:val="24"/>
           <w:szCs w:val="24"/>
           <w:lang w:eastAsia="pl-PL"/>
         </w:rPr>
-      </w:pPr>
+        <w:t xml:space="preserve">Edytuj plik </w:t>
+      </w:r>
+      <w:r>
+        <w:rPr>
+          <w:rFonts w:ascii="Courier New" w:eastAsia="Times New Roman" w:hAnsi="Courier New" w:cs="Courier New"/>
+          <w:sz w:val="20"/>
+          <w:szCs w:val="20"/>
+          <w:lang w:eastAsia="pl-PL"/>
+        </w:rPr>
+        <w:t>CMakeLists.txt</w:t>
+      </w:r>
+      <w:r>
+        <w:rPr>
+          <w:rFonts w:ascii="Courier New" w:eastAsia="Times New Roman" w:hAnsi="Courier New" w:cs="Courier New"/>
+          <w:sz w:val="20"/>
+          <w:szCs w:val="20"/>
+          <w:lang w:eastAsia="pl-PL"/>
+        </w:rPr>
+        <w:t xml:space="preserve"> </w:t>
+      </w:r>
       <w:r>
         <w:rPr>
           <w:rFonts w:ascii="Times New Roman" w:eastAsia="Times New Roman" w:hAnsi="Times New Roman" w:cs="Times New Roman"/>
@@ -1575,42 +1602,721 @@
           <w:szCs w:val="24"/>
           <w:lang w:eastAsia="pl-PL"/>
         </w:rPr>
-        <w:t xml:space="preserve">Visual Studio → </w:t>
+        <w:t>nadając odpowiednią nazwę katalogu z kodem FLTK</w:t>
       </w:r>
       <w:r>
         <w:rPr>
           <w:rFonts w:ascii="Times New Roman" w:eastAsia="Times New Roman" w:hAnsi="Times New Roman" w:cs="Times New Roman"/>
-          <w:i/>
-          <w:iCs/>
-          <w:sz w:val="24"/>
-          <w:szCs w:val="24"/>
-          <w:lang w:eastAsia="pl-PL"/>
-        </w:rPr>
-        <w:t>Open</w:t>
-      </w:r>
-      <w:r>
-        <w:rPr>
-          <w:rFonts w:ascii="Times New Roman" w:eastAsia="Times New Roman" w:hAnsi="Times New Roman" w:cs="Times New Roman"/>
-          <w:sz w:val="24"/>
-          <w:szCs w:val="24"/>
-          <w:lang w:eastAsia="pl-PL"/>
-        </w:rPr>
-        <w:t xml:space="preserve"> → </w:t>
-      </w:r>
-      <w:r>
-        <w:rPr>
-          <w:rFonts w:ascii="Times New Roman" w:eastAsia="Times New Roman" w:hAnsi="Times New Roman" w:cs="Times New Roman"/>
-          <w:i/>
-          <w:iCs/>
-          <w:sz w:val="24"/>
-          <w:szCs w:val="24"/>
-          <w:lang w:eastAsia="pl-PL"/>
-        </w:rPr>
-        <w:t>Folder</w:t>
-      </w:r>
-    </w:p>
-    <w:p>
-      <w:pPr>
+          <w:sz w:val="24"/>
+          <w:szCs w:val="24"/>
+          <w:lang w:eastAsia="pl-PL"/>
+        </w:rPr>
+        <w:t xml:space="preserve"> (np. fltk-1.4.5)</w:t>
+      </w:r>
+    </w:p>
+    <w:p>
+      <w:pPr>
+        <w:pStyle w:val="Akapitzlist"/>
+        <w:spacing w:before="100" w:beforeAutospacing="1" w:after="100" w:afterAutospacing="1" w:line="240" w:lineRule="auto"/>
+        <w:rPr>
+          <w:rFonts w:ascii="Courier New" w:eastAsia="Times New Roman" w:hAnsi="Courier New" w:cs="Courier New"/>
+          <w:sz w:val="20"/>
+          <w:szCs w:val="20"/>
+          <w:lang w:eastAsia="pl-PL"/>
+        </w:rPr>
+      </w:pPr>
+      <w:r>
+        <w:rPr>
+          <w:rFonts w:ascii="Courier New" w:eastAsia="Times New Roman" w:hAnsi="Courier New" w:cs="Courier New"/>
+          <w:sz w:val="20"/>
+          <w:szCs w:val="20"/>
+          <w:lang w:eastAsia="pl-PL"/>
+        </w:rPr>
+        <w:t>cmake_minimum_required(VERSION 3.12)</w:t>
+      </w:r>
+    </w:p>
+    <w:p>
+      <w:pPr>
+        <w:pStyle w:val="Akapitzlist"/>
+        <w:spacing w:before="100" w:beforeAutospacing="1" w:after="100" w:afterAutospacing="1" w:line="240" w:lineRule="auto"/>
+        <w:rPr>
+          <w:rFonts w:ascii="Courier New" w:eastAsia="Times New Roman" w:hAnsi="Courier New" w:cs="Courier New"/>
+          <w:sz w:val="20"/>
+          <w:szCs w:val="20"/>
+          <w:lang w:eastAsia="pl-PL"/>
+        </w:rPr>
+      </w:pPr>
+      <w:r>
+        <w:rPr>
+          <w:rFonts w:ascii="Courier New" w:eastAsia="Times New Roman" w:hAnsi="Courier New" w:cs="Courier New"/>
+          <w:sz w:val="20"/>
+          <w:szCs w:val="20"/>
+          <w:lang w:eastAsia="pl-PL"/>
+        </w:rPr>
+        <w:t>project(GUI-PPP2-main CXX)</w:t>
+      </w:r>
+    </w:p>
+    <w:p>
+      <w:pPr>
+        <w:pStyle w:val="Akapitzlist"/>
+        <w:spacing w:before="100" w:beforeAutospacing="1" w:after="100" w:afterAutospacing="1" w:line="240" w:lineRule="auto"/>
+        <w:rPr>
+          <w:rFonts w:ascii="Courier New" w:eastAsia="Times New Roman" w:hAnsi="Courier New" w:cs="Courier New"/>
+          <w:sz w:val="20"/>
+          <w:szCs w:val="20"/>
+          <w:lang w:eastAsia="pl-PL"/>
+        </w:rPr>
+      </w:pPr>
+    </w:p>
+    <w:p>
+      <w:pPr>
+        <w:pStyle w:val="Akapitzlist"/>
+        <w:spacing w:before="100" w:beforeAutospacing="1" w:after="100" w:afterAutospacing="1" w:line="240" w:lineRule="auto"/>
+        <w:rPr>
+          <w:rFonts w:ascii="Courier New" w:eastAsia="Times New Roman" w:hAnsi="Courier New" w:cs="Courier New"/>
+          <w:sz w:val="20"/>
+          <w:szCs w:val="20"/>
+          <w:lang w:eastAsia="pl-PL"/>
+        </w:rPr>
+      </w:pPr>
+      <w:r>
+        <w:rPr>
+          <w:rFonts w:ascii="Courier New" w:eastAsia="Times New Roman" w:hAnsi="Courier New" w:cs="Courier New"/>
+          <w:sz w:val="20"/>
+          <w:szCs w:val="20"/>
+          <w:lang w:eastAsia="pl-PL"/>
+        </w:rPr>
+        <w:t>set(CMAKE_CXX_STANDARD 17)</w:t>
+      </w:r>
+    </w:p>
+    <w:p>
+      <w:pPr>
+        <w:pStyle w:val="Akapitzlist"/>
+        <w:spacing w:before="100" w:beforeAutospacing="1" w:after="100" w:afterAutospacing="1" w:line="240" w:lineRule="auto"/>
+        <w:rPr>
+          <w:rFonts w:ascii="Courier New" w:eastAsia="Times New Roman" w:hAnsi="Courier New" w:cs="Courier New"/>
+          <w:sz w:val="20"/>
+          <w:szCs w:val="20"/>
+          <w:lang w:eastAsia="pl-PL"/>
+        </w:rPr>
+      </w:pPr>
+      <w:r>
+        <w:rPr>
+          <w:rFonts w:ascii="Courier New" w:eastAsia="Times New Roman" w:hAnsi="Courier New" w:cs="Courier New"/>
+          <w:sz w:val="20"/>
+          <w:szCs w:val="20"/>
+          <w:lang w:eastAsia="pl-PL"/>
+        </w:rPr>
+        <w:t>set(CMAKE_CXX_STANDARD_REQUIRED ON)</w:t>
+      </w:r>
+    </w:p>
+    <w:p>
+      <w:pPr>
+        <w:pStyle w:val="Akapitzlist"/>
+        <w:spacing w:before="100" w:beforeAutospacing="1" w:after="100" w:afterAutospacing="1" w:line="240" w:lineRule="auto"/>
+        <w:rPr>
+          <w:rFonts w:ascii="Courier New" w:eastAsia="Times New Roman" w:hAnsi="Courier New" w:cs="Courier New"/>
+          <w:sz w:val="20"/>
+          <w:szCs w:val="20"/>
+          <w:lang w:eastAsia="pl-PL"/>
+        </w:rPr>
+      </w:pPr>
+    </w:p>
+    <w:p>
+      <w:pPr>
+        <w:pStyle w:val="Akapitzlist"/>
+        <w:spacing w:before="100" w:beforeAutospacing="1" w:after="100" w:afterAutospacing="1" w:line="240" w:lineRule="auto"/>
+        <w:rPr>
+          <w:rFonts w:ascii="Courier New" w:eastAsia="Times New Roman" w:hAnsi="Courier New" w:cs="Courier New"/>
+          <w:sz w:val="20"/>
+          <w:szCs w:val="20"/>
+          <w:lang w:eastAsia="pl-PL"/>
+        </w:rPr>
+      </w:pPr>
+      <w:r>
+        <w:rPr>
+          <w:rFonts w:ascii="Courier New" w:eastAsia="Times New Roman" w:hAnsi="Courier New" w:cs="Courier New"/>
+          <w:sz w:val="20"/>
+          <w:szCs w:val="20"/>
+          <w:lang w:eastAsia="pl-PL"/>
+        </w:rPr>
+        <w:t># Automatyczne znalezienie FLTK w folderze obok projektu</w:t>
+      </w:r>
+    </w:p>
+    <w:p>
+      <w:pPr>
+        <w:pStyle w:val="Akapitzlist"/>
+        <w:spacing w:before="100" w:beforeAutospacing="1" w:after="100" w:afterAutospacing="1" w:line="240" w:lineRule="auto"/>
+        <w:rPr>
+          <w:rFonts w:ascii="Courier New" w:eastAsia="Times New Roman" w:hAnsi="Courier New" w:cs="Courier New"/>
+          <w:sz w:val="20"/>
+          <w:szCs w:val="20"/>
+          <w:lang w:eastAsia="pl-PL"/>
+        </w:rPr>
+      </w:pPr>
+      <w:r>
+        <w:rPr>
+          <w:rFonts w:ascii="Courier New" w:eastAsia="Times New Roman" w:hAnsi="Courier New" w:cs="Courier New"/>
+          <w:sz w:val="20"/>
+          <w:szCs w:val="20"/>
+          <w:lang w:eastAsia="pl-PL"/>
+        </w:rPr>
+        <w:t>list(APPEND CMAKE_PREFIX_PATH "${CMAKE_SOURCE_DIR}/../</w:t>
+      </w:r>
+      <w:r>
+        <w:rPr>
+          <w:rFonts w:ascii="Courier New" w:eastAsia="Times New Roman" w:hAnsi="Courier New" w:cs="Courier New"/>
+          <w:color w:val="FF0000"/>
+          <w:sz w:val="20"/>
+          <w:szCs w:val="20"/>
+          <w:lang w:eastAsia="pl-PL"/>
+        </w:rPr>
+        <w:t>fltk</w:t>
+      </w:r>
+      <w:r>
+        <w:rPr>
+          <w:rFonts w:ascii="Courier New" w:eastAsia="Times New Roman" w:hAnsi="Courier New" w:cs="Courier New"/>
+          <w:sz w:val="20"/>
+          <w:szCs w:val="20"/>
+          <w:lang w:eastAsia="pl-PL"/>
+        </w:rPr>
+        <w:t>/install")</w:t>
+      </w:r>
+    </w:p>
+    <w:p>
+      <w:pPr>
+        <w:pStyle w:val="Akapitzlist"/>
+        <w:spacing w:before="100" w:beforeAutospacing="1" w:after="100" w:afterAutospacing="1" w:line="240" w:lineRule="auto"/>
+        <w:rPr>
+          <w:rFonts w:ascii="Courier New" w:eastAsia="Times New Roman" w:hAnsi="Courier New" w:cs="Courier New"/>
+          <w:sz w:val="20"/>
+          <w:szCs w:val="20"/>
+          <w:lang w:eastAsia="pl-PL"/>
+        </w:rPr>
+      </w:pPr>
+      <w:r>
+        <w:rPr>
+          <w:rFonts w:ascii="Courier New" w:eastAsia="Times New Roman" w:hAnsi="Courier New" w:cs="Courier New"/>
+          <w:sz w:val="20"/>
+          <w:szCs w:val="20"/>
+          <w:lang w:eastAsia="pl-PL"/>
+        </w:rPr>
+        <w:t>find_package(FLTK CONFIG REQUIRED)</w:t>
+      </w:r>
+    </w:p>
+    <w:p>
+      <w:pPr>
+        <w:pStyle w:val="Akapitzlist"/>
+        <w:spacing w:before="100" w:beforeAutospacing="1" w:after="100" w:afterAutospacing="1" w:line="240" w:lineRule="auto"/>
+        <w:rPr>
+          <w:rFonts w:ascii="Courier New" w:eastAsia="Times New Roman" w:hAnsi="Courier New" w:cs="Courier New"/>
+          <w:sz w:val="20"/>
+          <w:szCs w:val="20"/>
+          <w:lang w:eastAsia="pl-PL"/>
+        </w:rPr>
+      </w:pPr>
+    </w:p>
+    <w:p>
+      <w:pPr>
+        <w:pStyle w:val="Akapitzlist"/>
+        <w:spacing w:before="100" w:beforeAutospacing="1" w:after="100" w:afterAutospacing="1" w:line="240" w:lineRule="auto"/>
+        <w:rPr>
+          <w:rFonts w:ascii="Courier New" w:eastAsia="Times New Roman" w:hAnsi="Courier New" w:cs="Courier New"/>
+          <w:sz w:val="20"/>
+          <w:szCs w:val="20"/>
+          <w:lang w:eastAsia="pl-PL"/>
+        </w:rPr>
+      </w:pPr>
+      <w:r>
+        <w:rPr>
+          <w:rFonts w:ascii="Courier New" w:eastAsia="Times New Roman" w:hAnsi="Courier New" w:cs="Courier New"/>
+          <w:sz w:val="20"/>
+          <w:szCs w:val="20"/>
+          <w:lang w:eastAsia="pl-PL"/>
+        </w:rPr>
+        <w:t>add_executable(GUI-PPP2-main</w:t>
+      </w:r>
+    </w:p>
+    <w:p>
+      <w:pPr>
+        <w:pStyle w:val="Akapitzlist"/>
+        <w:spacing w:before="100" w:beforeAutospacing="1" w:after="100" w:afterAutospacing="1" w:line="240" w:lineRule="auto"/>
+        <w:rPr>
+          <w:rFonts w:ascii="Courier New" w:eastAsia="Times New Roman" w:hAnsi="Courier New" w:cs="Courier New"/>
+          <w:sz w:val="20"/>
+          <w:szCs w:val="20"/>
+          <w:lang w:eastAsia="pl-PL"/>
+        </w:rPr>
+      </w:pPr>
+      <w:r>
+        <w:rPr>
+          <w:rFonts w:ascii="Courier New" w:eastAsia="Times New Roman" w:hAnsi="Courier New" w:cs="Courier New"/>
+          <w:sz w:val="20"/>
+          <w:szCs w:val="20"/>
+          <w:lang w:eastAsia="pl-PL"/>
+        </w:rPr>
+        <w:t xml:space="preserve">    main.cpp</w:t>
+      </w:r>
+    </w:p>
+    <w:p>
+      <w:pPr>
+        <w:pStyle w:val="Akapitzlist"/>
+        <w:spacing w:before="100" w:beforeAutospacing="1" w:after="100" w:afterAutospacing="1" w:line="240" w:lineRule="auto"/>
+        <w:rPr>
+          <w:rFonts w:ascii="Courier New" w:eastAsia="Times New Roman" w:hAnsi="Courier New" w:cs="Courier New"/>
+          <w:sz w:val="20"/>
+          <w:szCs w:val="20"/>
+          <w:lang w:eastAsia="pl-PL"/>
+        </w:rPr>
+      </w:pPr>
+      <w:r>
+        <w:rPr>
+          <w:rFonts w:ascii="Courier New" w:eastAsia="Times New Roman" w:hAnsi="Courier New" w:cs="Courier New"/>
+          <w:sz w:val="20"/>
+          <w:szCs w:val="20"/>
+          <w:lang w:eastAsia="pl-PL"/>
+        </w:rPr>
+        <w:t xml:space="preserve">    GUI-PPP2/Window.cpp</w:t>
+      </w:r>
+    </w:p>
+    <w:p>
+      <w:pPr>
+        <w:pStyle w:val="Akapitzlist"/>
+        <w:spacing w:before="100" w:beforeAutospacing="1" w:after="100" w:afterAutospacing="1" w:line="240" w:lineRule="auto"/>
+        <w:rPr>
+          <w:rFonts w:ascii="Courier New" w:eastAsia="Times New Roman" w:hAnsi="Courier New" w:cs="Courier New"/>
+          <w:sz w:val="20"/>
+          <w:szCs w:val="20"/>
+          <w:lang w:eastAsia="pl-PL"/>
+        </w:rPr>
+      </w:pPr>
+      <w:r>
+        <w:rPr>
+          <w:rFonts w:ascii="Courier New" w:eastAsia="Times New Roman" w:hAnsi="Courier New" w:cs="Courier New"/>
+          <w:sz w:val="20"/>
+          <w:szCs w:val="20"/>
+          <w:lang w:eastAsia="pl-PL"/>
+        </w:rPr>
+        <w:t xml:space="preserve">    GUI-PPP2/Graph.cpp</w:t>
+      </w:r>
+    </w:p>
+    <w:p>
+      <w:pPr>
+        <w:pStyle w:val="Akapitzlist"/>
+        <w:spacing w:before="100" w:beforeAutospacing="1" w:after="100" w:afterAutospacing="1" w:line="240" w:lineRule="auto"/>
+        <w:rPr>
+          <w:rFonts w:ascii="Courier New" w:eastAsia="Times New Roman" w:hAnsi="Courier New" w:cs="Courier New"/>
+          <w:sz w:val="20"/>
+          <w:szCs w:val="20"/>
+          <w:lang w:eastAsia="pl-PL"/>
+        </w:rPr>
+      </w:pPr>
+      <w:r>
+        <w:rPr>
+          <w:rFonts w:ascii="Courier New" w:eastAsia="Times New Roman" w:hAnsi="Courier New" w:cs="Courier New"/>
+          <w:sz w:val="20"/>
+          <w:szCs w:val="20"/>
+          <w:lang w:eastAsia="pl-PL"/>
+        </w:rPr>
+        <w:t xml:space="preserve">    GUI-PPP2/GUI.cpp</w:t>
+      </w:r>
+    </w:p>
+    <w:p>
+      <w:pPr>
+        <w:pStyle w:val="Akapitzlist"/>
+        <w:spacing w:before="100" w:beforeAutospacing="1" w:after="100" w:afterAutospacing="1" w:line="240" w:lineRule="auto"/>
+        <w:rPr>
+          <w:rFonts w:ascii="Courier New" w:eastAsia="Times New Roman" w:hAnsi="Courier New" w:cs="Courier New"/>
+          <w:sz w:val="20"/>
+          <w:szCs w:val="20"/>
+          <w:lang w:eastAsia="pl-PL"/>
+        </w:rPr>
+      </w:pPr>
+      <w:r>
+        <w:rPr>
+          <w:rFonts w:ascii="Courier New" w:eastAsia="Times New Roman" w:hAnsi="Courier New" w:cs="Courier New"/>
+          <w:sz w:val="20"/>
+          <w:szCs w:val="20"/>
+          <w:lang w:eastAsia="pl-PL"/>
+        </w:rPr>
+        <w:t>)</w:t>
+      </w:r>
+    </w:p>
+    <w:p>
+      <w:pPr>
+        <w:pStyle w:val="Akapitzlist"/>
+        <w:spacing w:before="100" w:beforeAutospacing="1" w:after="100" w:afterAutospacing="1" w:line="240" w:lineRule="auto"/>
+        <w:rPr>
+          <w:rFonts w:ascii="Courier New" w:eastAsia="Times New Roman" w:hAnsi="Courier New" w:cs="Courier New"/>
+          <w:sz w:val="20"/>
+          <w:szCs w:val="20"/>
+          <w:lang w:eastAsia="pl-PL"/>
+        </w:rPr>
+      </w:pPr>
+    </w:p>
+    <w:p>
+      <w:pPr>
+        <w:pStyle w:val="Akapitzlist"/>
+        <w:spacing w:before="100" w:beforeAutospacing="1" w:after="100" w:afterAutospacing="1" w:line="240" w:lineRule="auto"/>
+        <w:rPr>
+          <w:rFonts w:ascii="Courier New" w:eastAsia="Times New Roman" w:hAnsi="Courier New" w:cs="Courier New"/>
+          <w:sz w:val="20"/>
+          <w:szCs w:val="20"/>
+          <w:lang w:eastAsia="pl-PL"/>
+        </w:rPr>
+      </w:pPr>
+      <w:r>
+        <w:rPr>
+          <w:rFonts w:ascii="Courier New" w:eastAsia="Times New Roman" w:hAnsi="Courier New" w:cs="Courier New"/>
+          <w:sz w:val="20"/>
+          <w:szCs w:val="20"/>
+          <w:lang w:eastAsia="pl-PL"/>
+        </w:rPr>
+        <w:t>target_include_directories(GUI-PPP2-main PRIVATE</w:t>
+      </w:r>
+    </w:p>
+    <w:p>
+      <w:pPr>
+        <w:pStyle w:val="Akapitzlist"/>
+        <w:spacing w:before="100" w:beforeAutospacing="1" w:after="100" w:afterAutospacing="1" w:line="240" w:lineRule="auto"/>
+        <w:rPr>
+          <w:rFonts w:ascii="Courier New" w:eastAsia="Times New Roman" w:hAnsi="Courier New" w:cs="Courier New"/>
+          <w:sz w:val="20"/>
+          <w:szCs w:val="20"/>
+          <w:lang w:eastAsia="pl-PL"/>
+        </w:rPr>
+      </w:pPr>
+      <w:r>
+        <w:rPr>
+          <w:rFonts w:ascii="Courier New" w:eastAsia="Times New Roman" w:hAnsi="Courier New" w:cs="Courier New"/>
+          <w:sz w:val="20"/>
+          <w:szCs w:val="20"/>
+          <w:lang w:eastAsia="pl-PL"/>
+        </w:rPr>
+        <w:t xml:space="preserve">    ${CMAKE_SOURCE_DIR}/GUI-PPP2</w:t>
+      </w:r>
+    </w:p>
+    <w:p>
+      <w:pPr>
+        <w:pStyle w:val="Akapitzlist"/>
+        <w:spacing w:before="100" w:beforeAutospacing="1" w:after="100" w:afterAutospacing="1" w:line="240" w:lineRule="auto"/>
+        <w:rPr>
+          <w:rFonts w:ascii="Courier New" w:eastAsia="Times New Roman" w:hAnsi="Courier New" w:cs="Courier New"/>
+          <w:sz w:val="20"/>
+          <w:szCs w:val="20"/>
+          <w:lang w:eastAsia="pl-PL"/>
+        </w:rPr>
+      </w:pPr>
+      <w:r>
+        <w:rPr>
+          <w:rFonts w:ascii="Courier New" w:eastAsia="Times New Roman" w:hAnsi="Courier New" w:cs="Courier New"/>
+          <w:sz w:val="20"/>
+          <w:szCs w:val="20"/>
+          <w:lang w:eastAsia="pl-PL"/>
+        </w:rPr>
+        <w:t>)</w:t>
+      </w:r>
+    </w:p>
+    <w:p>
+      <w:pPr>
+        <w:pStyle w:val="Akapitzlist"/>
+        <w:spacing w:before="100" w:beforeAutospacing="1" w:after="100" w:afterAutospacing="1" w:line="240" w:lineRule="auto"/>
+        <w:rPr>
+          <w:rFonts w:ascii="Courier New" w:eastAsia="Times New Roman" w:hAnsi="Courier New" w:cs="Courier New"/>
+          <w:sz w:val="20"/>
+          <w:szCs w:val="20"/>
+          <w:lang w:eastAsia="pl-PL"/>
+        </w:rPr>
+      </w:pPr>
+    </w:p>
+    <w:p>
+      <w:pPr>
+        <w:pStyle w:val="Akapitzlist"/>
+        <w:spacing w:before="100" w:beforeAutospacing="1" w:after="100" w:afterAutospacing="1" w:line="240" w:lineRule="auto"/>
+        <w:rPr>
+          <w:rFonts w:ascii="Courier New" w:eastAsia="Times New Roman" w:hAnsi="Courier New" w:cs="Courier New"/>
+          <w:sz w:val="20"/>
+          <w:szCs w:val="20"/>
+          <w:lang w:eastAsia="pl-PL"/>
+        </w:rPr>
+      </w:pPr>
+      <w:r>
+        <w:rPr>
+          <w:rFonts w:ascii="Courier New" w:eastAsia="Times New Roman" w:hAnsi="Courier New" w:cs="Courier New"/>
+          <w:sz w:val="20"/>
+          <w:szCs w:val="20"/>
+          <w:lang w:eastAsia="pl-PL"/>
+        </w:rPr>
+        <w:t>target_link_libraries(GUI-PPP2-main PRIVATE</w:t>
+      </w:r>
+    </w:p>
+    <w:p>
+      <w:pPr>
+        <w:pStyle w:val="Akapitzlist"/>
+        <w:spacing w:before="100" w:beforeAutospacing="1" w:after="100" w:afterAutospacing="1" w:line="240" w:lineRule="auto"/>
+        <w:rPr>
+          <w:rFonts w:ascii="Courier New" w:eastAsia="Times New Roman" w:hAnsi="Courier New" w:cs="Courier New"/>
+          <w:sz w:val="20"/>
+          <w:szCs w:val="20"/>
+          <w:lang w:eastAsia="pl-PL"/>
+        </w:rPr>
+      </w:pPr>
+      <w:r>
+        <w:rPr>
+          <w:rFonts w:ascii="Courier New" w:eastAsia="Times New Roman" w:hAnsi="Courier New" w:cs="Courier New"/>
+          <w:sz w:val="20"/>
+          <w:szCs w:val="20"/>
+          <w:lang w:eastAsia="pl-PL"/>
+        </w:rPr>
+        <w:t xml:space="preserve">    fltk</w:t>
+      </w:r>
+    </w:p>
+    <w:p>
+      <w:pPr>
+        <w:pStyle w:val="Akapitzlist"/>
+        <w:spacing w:before="100" w:beforeAutospacing="1" w:after="100" w:afterAutospacing="1" w:line="240" w:lineRule="auto"/>
+        <w:rPr>
+          <w:rFonts w:ascii="Courier New" w:eastAsia="Times New Roman" w:hAnsi="Courier New" w:cs="Courier New"/>
+          <w:sz w:val="20"/>
+          <w:szCs w:val="20"/>
+          <w:lang w:eastAsia="pl-PL"/>
+        </w:rPr>
+      </w:pPr>
+      <w:r>
+        <w:rPr>
+          <w:rFonts w:ascii="Courier New" w:eastAsia="Times New Roman" w:hAnsi="Courier New" w:cs="Courier New"/>
+          <w:sz w:val="20"/>
+          <w:szCs w:val="20"/>
+          <w:lang w:eastAsia="pl-PL"/>
+        </w:rPr>
+        <w:t xml:space="preserve">    fltk_images</w:t>
+      </w:r>
+    </w:p>
+    <w:p>
+      <w:pPr>
+        <w:pStyle w:val="Akapitzlist"/>
+        <w:spacing w:before="100" w:beforeAutospacing="1" w:after="100" w:afterAutospacing="1" w:line="240" w:lineRule="auto"/>
+        <w:rPr>
+          <w:rFonts w:ascii="Courier New" w:eastAsia="Times New Roman" w:hAnsi="Courier New" w:cs="Courier New"/>
+          <w:sz w:val="20"/>
+          <w:szCs w:val="20"/>
+          <w:lang w:eastAsia="pl-PL"/>
+        </w:rPr>
+      </w:pPr>
+      <w:r>
+        <w:rPr>
+          <w:rFonts w:ascii="Courier New" w:eastAsia="Times New Roman" w:hAnsi="Courier New" w:cs="Courier New"/>
+          <w:sz w:val="20"/>
+          <w:szCs w:val="20"/>
+          <w:lang w:eastAsia="pl-PL"/>
+        </w:rPr>
+        <w:t>)</w:t>
+      </w:r>
+    </w:p>
+    <w:p>
+      <w:pPr>
+        <w:pStyle w:val="Akapitzlist"/>
+        <w:spacing w:before="100" w:beforeAutospacing="1" w:after="100" w:afterAutospacing="1" w:line="240" w:lineRule="auto"/>
+        <w:rPr>
+          <w:rFonts w:ascii="Courier New" w:eastAsia="Times New Roman" w:hAnsi="Courier New" w:cs="Courier New"/>
+          <w:sz w:val="20"/>
+          <w:szCs w:val="20"/>
+          <w:lang w:eastAsia="pl-PL"/>
+        </w:rPr>
+      </w:pPr>
+    </w:p>
+    <w:p>
+      <w:pPr>
+        <w:pStyle w:val="Akapitzlist"/>
+        <w:spacing w:before="100" w:beforeAutospacing="1" w:after="100" w:afterAutospacing="1" w:line="240" w:lineRule="auto"/>
+        <w:rPr>
+          <w:rFonts w:ascii="Courier New" w:eastAsia="Times New Roman" w:hAnsi="Courier New" w:cs="Courier New"/>
+          <w:sz w:val="20"/>
+          <w:szCs w:val="20"/>
+          <w:lang w:eastAsia="pl-PL"/>
+        </w:rPr>
+      </w:pPr>
+      <w:r>
+        <w:rPr>
+          <w:rFonts w:ascii="Courier New" w:eastAsia="Times New Roman" w:hAnsi="Courier New" w:cs="Courier New"/>
+          <w:sz w:val="20"/>
+          <w:szCs w:val="20"/>
+          <w:lang w:eastAsia="pl-PL"/>
+        </w:rPr>
+        <w:t>if (WIN32)</w:t>
+      </w:r>
+    </w:p>
+    <w:p>
+      <w:pPr>
+        <w:pStyle w:val="Akapitzlist"/>
+        <w:spacing w:before="100" w:beforeAutospacing="1" w:after="100" w:afterAutospacing="1" w:line="240" w:lineRule="auto"/>
+        <w:rPr>
+          <w:rFonts w:ascii="Courier New" w:eastAsia="Times New Roman" w:hAnsi="Courier New" w:cs="Courier New"/>
+          <w:sz w:val="20"/>
+          <w:szCs w:val="20"/>
+          <w:lang w:eastAsia="pl-PL"/>
+        </w:rPr>
+      </w:pPr>
+      <w:r>
+        <w:rPr>
+          <w:rFonts w:ascii="Courier New" w:eastAsia="Times New Roman" w:hAnsi="Courier New" w:cs="Courier New"/>
+          <w:sz w:val="20"/>
+          <w:szCs w:val="20"/>
+          <w:lang w:eastAsia="pl-PL"/>
+        </w:rPr>
+        <w:t xml:space="preserve">    target_link_libraries(GUI-PPP2-main PRIVATE</w:t>
+      </w:r>
+    </w:p>
+    <w:p>
+      <w:pPr>
+        <w:pStyle w:val="Akapitzlist"/>
+        <w:spacing w:before="100" w:beforeAutospacing="1" w:after="100" w:afterAutospacing="1" w:line="240" w:lineRule="auto"/>
+        <w:rPr>
+          <w:rFonts w:ascii="Courier New" w:eastAsia="Times New Roman" w:hAnsi="Courier New" w:cs="Courier New"/>
+          <w:sz w:val="20"/>
+          <w:szCs w:val="20"/>
+          <w:lang w:eastAsia="pl-PL"/>
+        </w:rPr>
+      </w:pPr>
+      <w:r>
+        <w:rPr>
+          <w:rFonts w:ascii="Courier New" w:eastAsia="Times New Roman" w:hAnsi="Courier New" w:cs="Courier New"/>
+          <w:sz w:val="20"/>
+          <w:szCs w:val="20"/>
+          <w:lang w:eastAsia="pl-PL"/>
+        </w:rPr>
+        <w:t xml:space="preserve">        ws2_32</w:t>
+      </w:r>
+    </w:p>
+    <w:p>
+      <w:pPr>
+        <w:pStyle w:val="Akapitzlist"/>
+        <w:spacing w:before="100" w:beforeAutospacing="1" w:after="100" w:afterAutospacing="1" w:line="240" w:lineRule="auto"/>
+        <w:rPr>
+          <w:rFonts w:ascii="Courier New" w:eastAsia="Times New Roman" w:hAnsi="Courier New" w:cs="Courier New"/>
+          <w:sz w:val="20"/>
+          <w:szCs w:val="20"/>
+          <w:lang w:eastAsia="pl-PL"/>
+        </w:rPr>
+      </w:pPr>
+      <w:r>
+        <w:rPr>
+          <w:rFonts w:ascii="Courier New" w:eastAsia="Times New Roman" w:hAnsi="Courier New" w:cs="Courier New"/>
+          <w:sz w:val="20"/>
+          <w:szCs w:val="20"/>
+          <w:lang w:eastAsia="pl-PL"/>
+        </w:rPr>
+        <w:t xml:space="preserve">        comctl32</w:t>
+      </w:r>
+    </w:p>
+    <w:p>
+      <w:pPr>
+        <w:pStyle w:val="Akapitzlist"/>
+        <w:spacing w:before="100" w:beforeAutospacing="1" w:after="100" w:afterAutospacing="1" w:line="240" w:lineRule="auto"/>
+        <w:rPr>
+          <w:rFonts w:ascii="Courier New" w:eastAsia="Times New Roman" w:hAnsi="Courier New" w:cs="Courier New"/>
+          <w:sz w:val="20"/>
+          <w:szCs w:val="20"/>
+          <w:lang w:eastAsia="pl-PL"/>
+        </w:rPr>
+      </w:pPr>
+      <w:r>
+        <w:rPr>
+          <w:rFonts w:ascii="Courier New" w:eastAsia="Times New Roman" w:hAnsi="Courier New" w:cs="Courier New"/>
+          <w:sz w:val="20"/>
+          <w:szCs w:val="20"/>
+          <w:lang w:eastAsia="pl-PL"/>
+        </w:rPr>
+        <w:t xml:space="preserve">        gdi32</w:t>
+      </w:r>
+    </w:p>
+    <w:p>
+      <w:pPr>
+        <w:pStyle w:val="Akapitzlist"/>
+        <w:spacing w:before="100" w:beforeAutospacing="1" w:after="100" w:afterAutospacing="1" w:line="240" w:lineRule="auto"/>
+        <w:rPr>
+          <w:rFonts w:ascii="Courier New" w:eastAsia="Times New Roman" w:hAnsi="Courier New" w:cs="Courier New"/>
+          <w:sz w:val="20"/>
+          <w:szCs w:val="20"/>
+          <w:lang w:eastAsia="pl-PL"/>
+        </w:rPr>
+      </w:pPr>
+      <w:r>
+        <w:rPr>
+          <w:rFonts w:ascii="Courier New" w:eastAsia="Times New Roman" w:hAnsi="Courier New" w:cs="Courier New"/>
+          <w:sz w:val="20"/>
+          <w:szCs w:val="20"/>
+          <w:lang w:eastAsia="pl-PL"/>
+        </w:rPr>
+        <w:t xml:space="preserve">        ole32</w:t>
+      </w:r>
+    </w:p>
+    <w:p>
+      <w:pPr>
+        <w:pStyle w:val="Akapitzlist"/>
+        <w:spacing w:before="100" w:beforeAutospacing="1" w:after="100" w:afterAutospacing="1" w:line="240" w:lineRule="auto"/>
+        <w:rPr>
+          <w:rFonts w:ascii="Courier New" w:eastAsia="Times New Roman" w:hAnsi="Courier New" w:cs="Courier New"/>
+          <w:sz w:val="20"/>
+          <w:szCs w:val="20"/>
+          <w:lang w:eastAsia="pl-PL"/>
+        </w:rPr>
+      </w:pPr>
+      <w:r>
+        <w:rPr>
+          <w:rFonts w:ascii="Courier New" w:eastAsia="Times New Roman" w:hAnsi="Courier New" w:cs="Courier New"/>
+          <w:sz w:val="20"/>
+          <w:szCs w:val="20"/>
+          <w:lang w:eastAsia="pl-PL"/>
+        </w:rPr>
+        <w:t xml:space="preserve">        uuid</w:t>
+      </w:r>
+    </w:p>
+    <w:p>
+      <w:pPr>
+        <w:pStyle w:val="Akapitzlist"/>
+        <w:spacing w:before="100" w:beforeAutospacing="1" w:after="100" w:afterAutospacing="1" w:line="240" w:lineRule="auto"/>
+        <w:rPr>
+          <w:rFonts w:ascii="Courier New" w:eastAsia="Times New Roman" w:hAnsi="Courier New" w:cs="Courier New"/>
+          <w:sz w:val="20"/>
+          <w:szCs w:val="20"/>
+          <w:lang w:eastAsia="pl-PL"/>
+        </w:rPr>
+      </w:pPr>
+      <w:r>
+        <w:rPr>
+          <w:rFonts w:ascii="Courier New" w:eastAsia="Times New Roman" w:hAnsi="Courier New" w:cs="Courier New"/>
+          <w:sz w:val="20"/>
+          <w:szCs w:val="20"/>
+          <w:lang w:eastAsia="pl-PL"/>
+        </w:rPr>
+        <w:t xml:space="preserve">    )</w:t>
+      </w:r>
+    </w:p>
+    <w:p>
+      <w:pPr>
+        <w:pStyle w:val="Akapitzlist"/>
+        <w:spacing w:before="100" w:beforeAutospacing="1" w:after="100" w:afterAutospacing="1" w:line="240" w:lineRule="auto"/>
+        <w:rPr>
+          <w:rFonts w:ascii="Courier New" w:eastAsia="Times New Roman" w:hAnsi="Courier New" w:cs="Courier New"/>
+          <w:sz w:val="20"/>
+          <w:szCs w:val="20"/>
+          <w:lang w:eastAsia="pl-PL"/>
+        </w:rPr>
+      </w:pPr>
+      <w:r>
+        <w:rPr>
+          <w:rFonts w:ascii="Courier New" w:eastAsia="Times New Roman" w:hAnsi="Courier New" w:cs="Courier New"/>
+          <w:sz w:val="20"/>
+          <w:szCs w:val="20"/>
+          <w:lang w:eastAsia="pl-PL"/>
+        </w:rPr>
+        <w:t>endif()</w:t>
+      </w:r>
+    </w:p>
+    <w:p>
+      <w:pPr>
+        <w:pStyle w:val="Akapitzlist"/>
         <w:numPr>
           <w:ilvl w:val="0"/>
           <w:numId w:val="3"/>
@@ -1630,21 +2336,42 @@
           <w:szCs w:val="24"/>
           <w:lang w:eastAsia="pl-PL"/>
         </w:rPr>
-        <w:t xml:space="preserve">wybierz </w:t>
-      </w:r>
-      <w:r>
-        <w:rPr>
-          <w:rFonts w:ascii="Courier New" w:eastAsia="Times New Roman" w:hAnsi="Courier New" w:cs="Courier New"/>
-          <w:sz w:val="20"/>
-          <w:szCs w:val="20"/>
-          <w:lang w:eastAsia="pl-PL"/>
-        </w:rPr>
-        <w:t>D:\PB\2026\CPP2026\dev\GUI-PPP2-main</w:t>
-      </w:r>
-    </w:p>
-    <w:p>
-      <w:pPr>
-        <w:pStyle w:val="Akapitzlist"/>
+        <w:t xml:space="preserve">Visual Studio → </w:t>
+      </w:r>
+      <w:r>
+        <w:rPr>
+          <w:rFonts w:ascii="Times New Roman" w:eastAsia="Times New Roman" w:hAnsi="Times New Roman" w:cs="Times New Roman"/>
+          <w:i/>
+          <w:iCs/>
+          <w:sz w:val="24"/>
+          <w:szCs w:val="24"/>
+          <w:lang w:eastAsia="pl-PL"/>
+        </w:rPr>
+        <w:t>Open</w:t>
+      </w:r>
+      <w:r>
+        <w:rPr>
+          <w:rFonts w:ascii="Times New Roman" w:eastAsia="Times New Roman" w:hAnsi="Times New Roman" w:cs="Times New Roman"/>
+          <w:sz w:val="24"/>
+          <w:szCs w:val="24"/>
+          <w:lang w:eastAsia="pl-PL"/>
+        </w:rPr>
+        <w:t xml:space="preserve"> → </w:t>
+      </w:r>
+      <w:r>
+        <w:rPr>
+          <w:rFonts w:ascii="Times New Roman" w:eastAsia="Times New Roman" w:hAnsi="Times New Roman" w:cs="Times New Roman"/>
+          <w:i/>
+          <w:iCs/>
+          <w:sz w:val="24"/>
+          <w:szCs w:val="24"/>
+          <w:lang w:eastAsia="pl-PL"/>
+        </w:rPr>
+        <w:t>Folder</w:t>
+      </w:r>
+    </w:p>
+    <w:p>
+      <w:pPr>
         <w:numPr>
           <w:ilvl w:val="0"/>
           <w:numId w:val="3"/>
@@ -1664,6 +2391,40 @@
           <w:szCs w:val="24"/>
           <w:lang w:eastAsia="pl-PL"/>
         </w:rPr>
+        <w:t xml:space="preserve">wybierz </w:t>
+      </w:r>
+      <w:r>
+        <w:rPr>
+          <w:rFonts w:ascii="Courier New" w:eastAsia="Times New Roman" w:hAnsi="Courier New" w:cs="Courier New"/>
+          <w:sz w:val="20"/>
+          <w:szCs w:val="20"/>
+          <w:lang w:eastAsia="pl-PL"/>
+        </w:rPr>
+        <w:t>D:\PB\2026\CPP2026\dev\GUI-PPP2-main</w:t>
+      </w:r>
+    </w:p>
+    <w:p>
+      <w:pPr>
+        <w:pStyle w:val="Akapitzlist"/>
+        <w:numPr>
+          <w:ilvl w:val="0"/>
+          <w:numId w:val="3"/>
+        </w:numPr>
+        <w:spacing w:before="100" w:beforeAutospacing="1" w:after="100" w:afterAutospacing="1" w:line="240" w:lineRule="auto"/>
+        <w:rPr>
+          <w:rFonts w:ascii="Times New Roman" w:eastAsia="Times New Roman" w:hAnsi="Times New Roman" w:cs="Times New Roman"/>
+          <w:sz w:val="24"/>
+          <w:szCs w:val="24"/>
+          <w:lang w:eastAsia="pl-PL"/>
+        </w:rPr>
+      </w:pPr>
+      <w:r>
+        <w:rPr>
+          <w:rFonts w:ascii="Times New Roman" w:eastAsia="Times New Roman" w:hAnsi="Times New Roman" w:cs="Times New Roman"/>
+          <w:sz w:val="24"/>
+          <w:szCs w:val="24"/>
+          <w:lang w:eastAsia="pl-PL"/>
+        </w:rPr>
         <w:t>W Visual Studio:</w:t>
       </w:r>
     </w:p>
@@ -1761,6 +2522,7 @@
           <w:szCs w:val="24"/>
           <w:lang w:eastAsia="pl-PL"/>
         </w:rPr>
+        <w:lastRenderedPageBreak/>
         <mc:AlternateContent>
           <mc:Choice Requires="wps">
             <w:drawing>
@@ -3028,6 +3790,7 @@
   <w:style w:type="character" w:default="1" w:styleId="Domylnaczcionkaakapitu">
     <w:name w:val="Default Paragraph Font"/>
     <w:uiPriority w:val="1"/>
+    <w:semiHidden/>
     <w:unhideWhenUsed/>
   </w:style>
   <w:style w:type="table" w:default="1" w:styleId="Standardowy">

</xml_diff>